<commit_message>
docs(career): finalize CV contact details
</commit_message>
<xml_diff>
--- a/docs/career/final/Valerii_Khoidas_CV_EN.docx
+++ b/docs/career/final/Valerii_Khoidas_CV_EN.docx
@@ -152,7 +152,15 @@
         <w:rPr>
           <w:b w:val="0"/>
         </w:rPr>
-        <w:t xml:space="preserve"> [LinkedIn URL]</w:t>
+        <w:t xml:space="preserve"> </w:t>
+      </w:r>
+      <w:r>
+        <w:rPr>
+          <w:b w:val="0"/>
+          <w:color w:val="0000FF"/>
+          <w:u w:val="single"/>
+        </w:rPr>
+        <w:t>https://www.linkedin.com/in/valeriy-khoidas-18622290/</w:t>
       </w:r>
     </w:p>
     <w:p>
@@ -694,7 +702,7 @@
         <w:rPr>
           <w:b w:val="0"/>
         </w:rPr>
-        <w:t>English: [level]</w:t>
+        <w:t>English: A2–B1 / Pre-Intermediate</w:t>
       </w:r>
     </w:p>
     <w:sectPr>

</xml_diff>